<commit_message>
Added context to spin-locks, more infos about classes and more
</commit_message>
<xml_diff>
--- a/chestii de cpp/clase/constructori/Aggregate-Initialization.docx
+++ b/chestii de cpp/clase/constructori/Aggregate-Initialization.docx
@@ -12,7 +12,6 @@
         <w:tab/>
         <w:tab/>
         <w:tab/>
-        <w:tab/>
         <w:t>Aggregate Initialization</w:t>
       </w:r>
     </w:p>
@@ -74,15 +73,29 @@
       </w:pPr>
       <w:r>
         <w:rPr/>
-        <w:t>Daca dai mai putine argumente decat sunt membrii</w:t>
-      </w:r>
-      <w:r>
-        <w:rPr/>
-        <w:t>,</w:t>
-      </w:r>
-      <w:r>
-        <w:rPr/>
-        <w:t xml:space="preserve"> restul membrilor vor fi intializati cu 0</w:t>
+        <w:t>-</w:t>
+      </w:r>
+      <w:r>
+        <w:rPr/>
+        <w:t xml:space="preserve">Daca dai </w:t>
+      </w:r>
+      <w:r>
+        <w:rPr>
+          <w:color w:val="C9211E"/>
+        </w:rPr>
+        <w:t xml:space="preserve">mai putine argumente </w:t>
+      </w:r>
+      <w:r>
+        <w:rPr/>
+        <w:t>decat sunt membrii</w:t>
+      </w:r>
+      <w:r>
+        <w:rPr/>
+        <w:t xml:space="preserve"> de clasa</w:t>
+      </w:r>
+      <w:r>
+        <w:rPr/>
+        <w:t>, restul membrilor vor fi intializati cu 0</w:t>
       </w:r>
     </w:p>
     <w:p>
@@ -92,7 +105,25 @@
       </w:pPr>
       <w:r>
         <w:rPr/>
-        <w:t>Daca dai mai multe argumente decat sunt membrii de clasa, vei primi eroare</w:t>
+        <w:t>-</w:t>
+      </w:r>
+      <w:r>
+        <w:rPr/>
+        <w:t xml:space="preserve">Daca </w:t>
+      </w:r>
+      <w:r>
+        <w:rPr>
+          <w:color w:val="C9211E"/>
+        </w:rPr>
+        <w:t>dai mai multe</w:t>
+      </w:r>
+      <w:r>
+        <w:rPr/>
+        <w:t xml:space="preserve"> argumente decat sunt membrii de clasa, </w:t>
+      </w:r>
+      <w:r>
+        <w:rPr/>
+        <w:t>eroare de compilare</w:t>
       </w:r>
     </w:p>
     <w:p>
@@ -111,7 +142,17 @@
       </w:pPr>
       <w:r>
         <w:rPr/>
-        <w:t>-Daca apelezi aggregate initialization cu paranteze rotunde “ () “, o sa incerce sa faca si promovari, si conversii</w:t>
+        <w:t xml:space="preserve">-Daca apelezi aggregate initialization cu paranteze rotunde </w:t>
+      </w:r>
+      <w:r>
+        <w:rPr>
+          <w:color w:val="C9211E"/>
+        </w:rPr>
+        <w:t>“ () “</w:t>
+      </w:r>
+      <w:r>
+        <w:rPr/>
+        <w:t>, o sa incerce sa faca si promovari, si conversii</w:t>
       </w:r>
     </w:p>
     <w:p>
@@ -125,7 +166,17 @@
       </w:pPr>
       <w:r>
         <w:rPr/>
-        <w:t xml:space="preserve">-Daca apelezi aggregate initialization cu “ {} “ o sa incerce sa faca doar promovari. </w:t>
+        <w:t xml:space="preserve">-Daca apelezi aggregate initialization cu </w:t>
+      </w:r>
+      <w:r>
+        <w:rPr>
+          <w:color w:val="C9211E"/>
+        </w:rPr>
+        <w:t>“ {} “</w:t>
+      </w:r>
+      <w:r>
+        <w:rPr/>
+        <w:t xml:space="preserve"> o sa incerce sa faca doar promovari. </w:t>
       </w:r>
     </w:p>
     <w:sectPr>
@@ -543,6 +594,7 @@
     <w:qFormat/>
     <w:pPr>
       <w:widowControl/>
+      <w:suppressAutoHyphens w:val="true"/>
       <w:bidi w:val="0"/>
       <w:spacing w:lineRule="auto" w:line="276" w:before="0" w:after="160"/>
       <w:jc w:val="left"/>

</xml_diff>